<commit_message>
Start here: mascot added (EN/FR/NL/DE)
</commit_message>
<xml_diff>
--- a/source/de/start-here.docx
+++ b/source/de/start-here.docx
@@ -2,52 +2,139 @@
 <file path=word/document.xml><?xml version="1.0" encoding="utf-8"?>
 <w:document xmlns:wpc="http://schemas.microsoft.com/office/word/2010/wordprocessingCanvas" xmlns:mc="http://schemas.openxmlformats.org/markup-compatibility/2006" xmlns:o="urn:schemas-microsoft-com:office:office" xmlns:r="http://schemas.openxmlformats.org/officeDocument/2006/relationships" xmlns:m="http://schemas.openxmlformats.org/officeDocument/2006/math" xmlns:v="urn:schemas-microsoft-com:vml" xmlns:wp14="http://schemas.microsoft.com/office/word/2010/wordprocessingDrawing" xmlns:wp="http://schemas.openxmlformats.org/drawingml/2006/wordprocessingDrawing" xmlns:w10="urn:schemas-microsoft-com:office:word" xmlns:w="http://schemas.openxmlformats.org/wordprocessingml/2006/main" xmlns:w14="http://schemas.microsoft.com/office/word/2010/wordml" xmlns:w15="http://schemas.microsoft.com/office/word/2012/wordml" xmlns:wpg="http://schemas.microsoft.com/office/word/2010/wordprocessingGroup" xmlns:wpi="http://schemas.microsoft.com/office/word/2010/wordprocessingInk" xmlns:wne="http://schemas.microsoft.com/office/word/2006/wordml" xmlns:wps="http://schemas.microsoft.com/office/word/2010/wordprocessingShape" xmlns:cx="http://schemas.microsoft.com/office/drawing/2014/chartex" xmlns:cx1="http://schemas.microsoft.com/office/drawing/2015/9/8/chartex" xmlns:cx2="http://schemas.microsoft.com/office/drawing/2015/10/21/chartex" xmlns:cx3="http://schemas.microsoft.com/office/drawing/2016/5/9/chartex" xmlns:cx4="http://schemas.microsoft.com/office/drawing/2016/5/10/chartex" xmlns:cx5="http://schemas.microsoft.com/office/drawing/2016/5/11/chartex" xmlns:cx6="http://schemas.microsoft.com/office/drawing/2016/5/12/chartex" xmlns:cx7="http://schemas.microsoft.com/office/drawing/2016/5/13/chartex" xmlns:cx8="http://schemas.microsoft.com/office/drawing/2016/5/14/chartex" xmlns:aink="http://schemas.microsoft.com/office/drawing/2016/ink" xmlns:am3d="http://schemas.microsoft.com/office/drawing/2017/model3d" xmlns:w16cex="http://schemas.microsoft.com/office/word/2018/wordml/cex" xmlns:w16cid="http://schemas.microsoft.com/office/word/2016/wordml/cid" xmlns:w16="http://schemas.microsoft.com/office/word/2018/wordml" xmlns:w16sdtdh="http://schemas.microsoft.com/office/word/2020/wordml/sdtdatahash" xmlns:w16se="http://schemas.microsoft.com/office/word/2015/wordml/symex" mc:Ignorable="w14 w15 wp14">
   <w:body>
-    <w:p>
-      <w:pPr>
-        <w:spacing w:before="200" w:after="60"/>
-      </w:pPr>
-      <w:r>
-        <w:rPr>
-          <w:b/>
-          <w:bCs/>
-          <w:color w:val="1F3A5F"/>
-          <w:sz w:val="52"/>
-          <w:szCs w:val="52"/>
-        </w:rPr>
-        <w:t xml:space="preserve">Hier beginnen</w:t>
-      </w:r>
-    </w:p>
-    <w:p>
-      <w:pPr>
-        <w:spacing w:after="60"/>
-      </w:pPr>
-      <w:r>
-        <w:rPr>
-          <w:i/>
-          <w:iCs/>
-          <w:color w:val="B7892B"/>
-          <w:sz w:val="28"/>
-          <w:szCs w:val="28"/>
-        </w:rPr>
-        <w:t xml:space="preserve">Noch nie eine KI benutzt? Fangen Sie hier an.</w:t>
-      </w:r>
-    </w:p>
-    <w:p>
-      <w:pPr>
-        <w:pBdr>
-          <w:bottom w:val="single" w:color="B7892B" w:sz="8" w:space="6"/>
-        </w:pBdr>
-        <w:spacing w:after="240"/>
-      </w:pPr>
-      <w:r>
-        <w:rPr>
-          <w:color w:val="5A5A5A"/>
-          <w:sz w:val="18"/>
-          <w:szCs w:val="18"/>
-        </w:rPr>
-        <w:t xml:space="preserve">Erstellt von Hans Tandt · Version 1.0 · September 2026</w:t>
-      </w:r>
-    </w:p>
+    <w:tbl>
+      <w:tblPr>
+        <w:tblW w:type="dxa" w:w="9026"/>
+        <w:tblLayout w:type="fixed"/>
+      </w:tblPr>
+      <w:tblGrid>
+        <w:gridCol w:w="7026"/>
+        <w:gridCol w:w="2000"/>
+      </w:tblGrid>
+      <w:tr>
+        <w:tc>
+          <w:tcPr>
+            <w:tcW w:type="dxa" w:w="7026"/>
+            <w:tcBorders>
+              <w:top w:val="nil"/>
+              <w:left w:val="nil"/>
+              <w:bottom w:val="nil"/>
+              <w:right w:val="nil"/>
+            </w:tcBorders>
+            <w:vAlign w:val="center"/>
+            <w:tcMar>
+              <w:top w:type="dxa" w:w="80"/>
+              <w:left w:type="dxa" w:w="140"/>
+              <w:bottom w:type="dxa" w:w="80"/>
+              <w:right w:type="dxa" w:w="140"/>
+            </w:tcMar>
+          </w:tcPr>
+          <w:p>
+            <w:pPr>
+              <w:spacing w:before="200" w:after="60"/>
+            </w:pPr>
+            <w:r>
+              <w:rPr>
+                <w:b/>
+                <w:bCs/>
+                <w:color w:val="1F3A5F"/>
+                <w:sz w:val="52"/>
+                <w:szCs w:val="52"/>
+              </w:rPr>
+              <w:t xml:space="preserve">Hier beginnen</w:t>
+            </w:r>
+          </w:p>
+          <w:p>
+            <w:pPr>
+              <w:spacing w:after="60"/>
+            </w:pPr>
+            <w:r>
+              <w:rPr>
+                <w:i/>
+                <w:iCs/>
+                <w:color w:val="B7892B"/>
+                <w:sz w:val="28"/>
+                <w:szCs w:val="28"/>
+              </w:rPr>
+              <w:t xml:space="preserve">Noch nie eine KI benutzt? Fangen Sie hier an.</w:t>
+            </w:r>
+          </w:p>
+          <w:p>
+            <w:pPr>
+              <w:pBdr>
+                <w:bottom w:val="single" w:color="B7892B" w:sz="8" w:space="6"/>
+              </w:pBdr>
+              <w:spacing w:after="240"/>
+            </w:pPr>
+            <w:r>
+              <w:rPr>
+                <w:color w:val="5A5A5A"/>
+                <w:sz w:val="18"/>
+                <w:szCs w:val="18"/>
+              </w:rPr>
+              <w:t xml:space="preserve">Erstellt von Hans Tandt · Version 1.0 · September 2026</w:t>
+            </w:r>
+          </w:p>
+        </w:tc>
+        <w:tc>
+          <w:tcPr>
+            <w:tcW w:type="dxa" w:w="2000"/>
+            <w:tcBorders>
+              <w:top w:val="nil"/>
+              <w:left w:val="nil"/>
+              <w:bottom w:val="nil"/>
+              <w:right w:val="nil"/>
+            </w:tcBorders>
+            <w:vAlign w:val="center"/>
+            <w:tcMar>
+              <w:top w:type="dxa" w:w="80"/>
+              <w:left w:type="dxa" w:w="140"/>
+              <w:bottom w:type="dxa" w:w="80"/>
+              <w:right w:type="dxa" w:w="140"/>
+            </w:tcMar>
+          </w:tcPr>
+          <w:p>
+            <w:pPr>
+              <w:spacing w:after="0"/>
+              <w:jc w:val="center"/>
+            </w:pPr>
+            <w:r>
+              <w:drawing>
+                <wp:inline distT="0" distB="0" distL="0" distR="0">
+                  <wp:extent cx="495000" cy="936000"/>
+                  <wp:docPr id="901" name="Mascot 1" descr="Mascot"/>
+                  <a:graphic xmlns:a="http://schemas.openxmlformats.org/drawingml/2006/main">
+                    <a:graphicData uri="http://schemas.openxmlformats.org/drawingml/2006/picture">
+                      <pic:pic xmlns:pic="http://schemas.openxmlformats.org/drawingml/2006/picture">
+                        <pic:nvPicPr>
+                          <pic:cNvPr id="901" name="img1.png"/>
+                          <pic:cNvPicPr/>
+                        </pic:nvPicPr>
+                        <pic:blipFill>
+                          <a:blip r:embed="rIdImg1"/>
+                          <a:stretch>
+                            <a:fillRect/>
+                          </a:stretch>
+                        </pic:blipFill>
+                        <pic:spPr>
+                          <a:xfrm>
+                            <a:off x="0" y="0"/>
+                            <a:ext cx="495000" cy="936000"/>
+                          </a:xfrm>
+                          <a:prstGeom prst="rect">
+                            <a:avLst/>
+                          </a:prstGeom>
+                        </pic:spPr>
+                      </pic:pic>
+                    </a:graphicData>
+                  </a:graphic>
+                </wp:inline>
+              </w:drawing>
+            </w:r>
+          </w:p>
+        </w:tc>
+      </w:tr>
+    </w:tbl>
     <w:p>
       <w:pPr>
         <w:keepLines/>
@@ -450,9 +537,11 @@
     <w:tbl>
       <w:tblPr>
         <w:tblW w:type="dxa" w:w="9026"/>
+        <w:tblLayout w:type="fixed"/>
       </w:tblPr>
       <w:tblGrid>
-        <w:gridCol w:w="9026"/>
+        <w:gridCol w:w="1000"/>
+        <w:gridCol w:w="8026"/>
       </w:tblGrid>
       <w:tr>
         <w:trPr>
@@ -460,24 +549,82 @@
         </w:trPr>
         <w:tc>
           <w:tcPr>
-            <w:tcW w:type="dxa" w:w="9026"/>
+            <w:tcW w:type="dxa" w:w="1000"/>
             <w:tcBorders>
               <w:top w:val="single" w:color="2E7D32" w:sz="2"/>
               <w:left w:val="single" w:color="2E7D32" w:sz="18"/>
               <w:bottom w:val="single" w:color="2E7D32" w:sz="2"/>
+              <w:right w:val="nil"/>
+            </w:tcBorders>
+            <w:shd w:fill="EAF3EA" w:val="clear"/>
+            <w:vAlign w:val="center"/>
+            <w:tcMar>
+              <w:top w:type="dxa" w:w="80"/>
+              <w:left w:type="dxa" w:w="140"/>
+              <w:bottom w:type="dxa" w:w="80"/>
+              <w:right w:type="dxa" w:w="140"/>
+            </w:tcMar>
+          </w:tcPr>
+          <w:p>
+            <w:pPr>
+              <w:spacing w:after="0"/>
+              <w:jc w:val="center"/>
+            </w:pPr>
+            <w:r>
+              <w:drawing>
+                <wp:inline distT="0" distB="0" distL="0" distR="0">
+                  <wp:extent cx="351346" cy="522000"/>
+                  <wp:docPr id="902" name="Mascot 2" descr="Mascot"/>
+                  <a:graphic xmlns:a="http://schemas.openxmlformats.org/drawingml/2006/main">
+                    <a:graphicData uri="http://schemas.openxmlformats.org/drawingml/2006/picture">
+                      <pic:pic xmlns:pic="http://schemas.openxmlformats.org/drawingml/2006/picture">
+                        <pic:nvPicPr>
+                          <pic:cNvPr id="902" name="img2.png"/>
+                          <pic:cNvPicPr/>
+                        </pic:nvPicPr>
+                        <pic:blipFill>
+                          <a:blip r:embed="rIdImg2"/>
+                          <a:stretch>
+                            <a:fillRect/>
+                          </a:stretch>
+                        </pic:blipFill>
+                        <pic:spPr>
+                          <a:xfrm>
+                            <a:off x="0" y="0"/>
+                            <a:ext cx="351346" cy="522000"/>
+                          </a:xfrm>
+                          <a:prstGeom prst="rect">
+                            <a:avLst/>
+                          </a:prstGeom>
+                        </pic:spPr>
+                      </pic:pic>
+                    </a:graphicData>
+                  </a:graphic>
+                </wp:inline>
+              </w:drawing>
+            </w:r>
+          </w:p>
+        </w:tc>
+        <w:tc>
+          <w:tcPr>
+            <w:tcW w:type="dxa" w:w="8026"/>
+            <w:tcBorders>
+              <w:top w:val="single" w:color="2E7D32" w:sz="2"/>
+              <w:left w:val="nil"/>
+              <w:bottom w:val="single" w:color="2E7D32" w:sz="2"/>
               <w:right w:val="single" w:color="2E7D32" w:sz="2"/>
             </w:tcBorders>
             <w:shd w:fill="EAF3EA" w:val="clear"/>
-            <w:tcMar>
-              <w:top w:type="dxa" w:w="120"/>
-              <w:left w:type="dxa" w:w="200"/>
-              <w:bottom w:type="dxa" w:w="120"/>
-              <w:right w:type="dxa" w:w="160"/>
-            </w:tcMar>
-          </w:tcPr>
-          <w:p>
-            <w:pPr>
-              <w:keepNext/>
+            <w:vAlign w:val="center"/>
+            <w:tcMar>
+              <w:top w:type="dxa" w:w="80"/>
+              <w:left w:type="dxa" w:w="140"/>
+              <w:bottom w:type="dxa" w:w="80"/>
+              <w:right w:type="dxa" w:w="140"/>
+            </w:tcMar>
+          </w:tcPr>
+          <w:p>
+            <w:pPr>
               <w:spacing w:after="60"/>
             </w:pPr>
             <w:r>
@@ -512,9 +659,11 @@
     <w:tbl>
       <w:tblPr>
         <w:tblW w:type="dxa" w:w="9026"/>
+        <w:tblLayout w:type="fixed"/>
       </w:tblPr>
       <w:tblGrid>
-        <w:gridCol w:w="9026"/>
+        <w:gridCol w:w="1000"/>
+        <w:gridCol w:w="8026"/>
       </w:tblGrid>
       <w:tr>
         <w:trPr>
@@ -522,24 +671,82 @@
         </w:trPr>
         <w:tc>
           <w:tcPr>
-            <w:tcW w:type="dxa" w:w="9026"/>
+            <w:tcW w:type="dxa" w:w="1000"/>
             <w:tcBorders>
               <w:top w:val="single" w:color="B7892B" w:sz="2"/>
               <w:left w:val="single" w:color="B7892B" w:sz="18"/>
               <w:bottom w:val="single" w:color="B7892B" w:sz="2"/>
+              <w:right w:val="nil"/>
+            </w:tcBorders>
+            <w:shd w:fill="FFF6E0" w:val="clear"/>
+            <w:vAlign w:val="center"/>
+            <w:tcMar>
+              <w:top w:type="dxa" w:w="80"/>
+              <w:left w:type="dxa" w:w="140"/>
+              <w:bottom w:type="dxa" w:w="80"/>
+              <w:right w:type="dxa" w:w="140"/>
+            </w:tcMar>
+          </w:tcPr>
+          <w:p>
+            <w:pPr>
+              <w:spacing w:after="0"/>
+              <w:jc w:val="center"/>
+            </w:pPr>
+            <w:r>
+              <w:drawing>
+                <wp:inline distT="0" distB="0" distL="0" distR="0">
+                  <wp:extent cx="336288" cy="522000"/>
+                  <wp:docPr id="903" name="Mascot 3" descr="Mascot"/>
+                  <a:graphic xmlns:a="http://schemas.openxmlformats.org/drawingml/2006/main">
+                    <a:graphicData uri="http://schemas.openxmlformats.org/drawingml/2006/picture">
+                      <pic:pic xmlns:pic="http://schemas.openxmlformats.org/drawingml/2006/picture">
+                        <pic:nvPicPr>
+                          <pic:cNvPr id="903" name="img3.png"/>
+                          <pic:cNvPicPr/>
+                        </pic:nvPicPr>
+                        <pic:blipFill>
+                          <a:blip r:embed="rIdImg3"/>
+                          <a:stretch>
+                            <a:fillRect/>
+                          </a:stretch>
+                        </pic:blipFill>
+                        <pic:spPr>
+                          <a:xfrm>
+                            <a:off x="0" y="0"/>
+                            <a:ext cx="336288" cy="522000"/>
+                          </a:xfrm>
+                          <a:prstGeom prst="rect">
+                            <a:avLst/>
+                          </a:prstGeom>
+                        </pic:spPr>
+                      </pic:pic>
+                    </a:graphicData>
+                  </a:graphic>
+                </wp:inline>
+              </w:drawing>
+            </w:r>
+          </w:p>
+        </w:tc>
+        <w:tc>
+          <w:tcPr>
+            <w:tcW w:type="dxa" w:w="8026"/>
+            <w:tcBorders>
+              <w:top w:val="single" w:color="B7892B" w:sz="2"/>
+              <w:left w:val="nil"/>
+              <w:bottom w:val="single" w:color="B7892B" w:sz="2"/>
               <w:right w:val="single" w:color="B7892B" w:sz="2"/>
             </w:tcBorders>
             <w:shd w:fill="FFF6E0" w:val="clear"/>
-            <w:tcMar>
-              <w:top w:type="dxa" w:w="120"/>
-              <w:left w:type="dxa" w:w="200"/>
-              <w:bottom w:type="dxa" w:w="120"/>
-              <w:right w:type="dxa" w:w="160"/>
-            </w:tcMar>
-          </w:tcPr>
-          <w:p>
-            <w:pPr>
-              <w:keepNext/>
+            <w:vAlign w:val="center"/>
+            <w:tcMar>
+              <w:top w:type="dxa" w:w="80"/>
+              <w:left w:type="dxa" w:w="140"/>
+              <w:bottom w:type="dxa" w:w="80"/>
+              <w:right w:type="dxa" w:w="140"/>
+            </w:tcMar>
+          </w:tcPr>
+          <w:p>
+            <w:pPr>
               <w:spacing w:after="60"/>
             </w:pPr>
             <w:r>
@@ -560,7 +767,7 @@
               <w:spacing w:after="60" w:line="262"/>
             </w:pPr>
             <w:r>
-              <w:t xml:space="preserve">Dieser Leitfaden gibt den Stand von September 2026 wieder. Sieht ein Bildschirm anders aus, vertrauen Sie der App.</w:t>
+              <w:t xml:space="preserve">Stand: September 2026. Sieht ein Bildschirm anders aus, vertrauen Sie der App.</w:t>
             </w:r>
           </w:p>
           <w:p>
@@ -570,7 +777,7 @@
               <w:spacing w:after="60" w:line="262"/>
             </w:pPr>
             <w:r>
-              <w:t xml:space="preserve">Chat und Cowork werden zu einer Claude-App zusammengeführt (seit Ende September 2026, zuerst bei Pro und Max).</w:t>
+              <w:t xml:space="preserve">Chat und Cowork werden gerade zu einer Claude-App zusammengeführt, zuerst bei Pro und Max.</w:t>
             </w:r>
           </w:p>
           <w:p>
@@ -580,7 +787,7 @@
               <w:spacing w:after="60" w:line="262"/>
             </w:pPr>
             <w:r>
-              <w:t xml:space="preserve">Alle Leitfäden, kostenlos, auf Englisch, Französisch, Niederländisch und Deutsch: </w:t>
+              <w:t xml:space="preserve">Alle Leitfäden, kostenlos, in vier Sprachen: </w:t>
             </w:r>
             <w:r>
               <w:rPr>
@@ -1249,9 +1456,11 @@
     <w:tbl>
       <w:tblPr>
         <w:tblW w:type="dxa" w:w="9026"/>
+        <w:tblLayout w:type="fixed"/>
       </w:tblPr>
       <w:tblGrid>
-        <w:gridCol w:w="9026"/>
+        <w:gridCol w:w="1000"/>
+        <w:gridCol w:w="8026"/>
       </w:tblGrid>
       <w:tr>
         <w:trPr>
@@ -1259,24 +1468,82 @@
         </w:trPr>
         <w:tc>
           <w:tcPr>
-            <w:tcW w:type="dxa" w:w="9026"/>
+            <w:tcW w:type="dxa" w:w="1000"/>
             <w:tcBorders>
               <w:top w:val="single" w:color="B23A3A" w:sz="2"/>
               <w:left w:val="single" w:color="B23A3A" w:sz="18"/>
               <w:bottom w:val="single" w:color="B23A3A" w:sz="2"/>
+              <w:right w:val="nil"/>
+            </w:tcBorders>
+            <w:shd w:fill="FBEAEA" w:val="clear"/>
+            <w:vAlign w:val="center"/>
+            <w:tcMar>
+              <w:top w:type="dxa" w:w="80"/>
+              <w:left w:type="dxa" w:w="140"/>
+              <w:bottom w:type="dxa" w:w="80"/>
+              <w:right w:type="dxa" w:w="140"/>
+            </w:tcMar>
+          </w:tcPr>
+          <w:p>
+            <w:pPr>
+              <w:spacing w:after="0"/>
+              <w:jc w:val="center"/>
+            </w:pPr>
+            <w:r>
+              <w:drawing>
+                <wp:inline distT="0" distB="0" distL="0" distR="0">
+                  <wp:extent cx="371423" cy="522000"/>
+                  <wp:docPr id="904" name="Mascot 4" descr="Mascot"/>
+                  <a:graphic xmlns:a="http://schemas.openxmlformats.org/drawingml/2006/main">
+                    <a:graphicData uri="http://schemas.openxmlformats.org/drawingml/2006/picture">
+                      <pic:pic xmlns:pic="http://schemas.openxmlformats.org/drawingml/2006/picture">
+                        <pic:nvPicPr>
+                          <pic:cNvPr id="904" name="img4.png"/>
+                          <pic:cNvPicPr/>
+                        </pic:nvPicPr>
+                        <pic:blipFill>
+                          <a:blip r:embed="rIdImg4"/>
+                          <a:stretch>
+                            <a:fillRect/>
+                          </a:stretch>
+                        </pic:blipFill>
+                        <pic:spPr>
+                          <a:xfrm>
+                            <a:off x="0" y="0"/>
+                            <a:ext cx="371423" cy="522000"/>
+                          </a:xfrm>
+                          <a:prstGeom prst="rect">
+                            <a:avLst/>
+                          </a:prstGeom>
+                        </pic:spPr>
+                      </pic:pic>
+                    </a:graphicData>
+                  </a:graphic>
+                </wp:inline>
+              </w:drawing>
+            </w:r>
+          </w:p>
+        </w:tc>
+        <w:tc>
+          <w:tcPr>
+            <w:tcW w:type="dxa" w:w="8026"/>
+            <w:tcBorders>
+              <w:top w:val="single" w:color="B23A3A" w:sz="2"/>
+              <w:left w:val="nil"/>
+              <w:bottom w:val="single" w:color="B23A3A" w:sz="2"/>
               <w:right w:val="single" w:color="B23A3A" w:sz="2"/>
             </w:tcBorders>
             <w:shd w:fill="FBEAEA" w:val="clear"/>
-            <w:tcMar>
-              <w:top w:type="dxa" w:w="120"/>
-              <w:left w:type="dxa" w:w="200"/>
-              <w:bottom w:type="dxa" w:w="120"/>
-              <w:right w:type="dxa" w:w="160"/>
-            </w:tcMar>
-          </w:tcPr>
-          <w:p>
-            <w:pPr>
-              <w:keepNext/>
+            <w:vAlign w:val="center"/>
+            <w:tcMar>
+              <w:top w:type="dxa" w:w="80"/>
+              <w:left w:type="dxa" w:w="140"/>
+              <w:bottom w:type="dxa" w:w="80"/>
+              <w:right w:type="dxa" w:w="140"/>
+            </w:tcMar>
+          </w:tcPr>
+          <w:p>
+            <w:pPr>
               <w:spacing w:after="60"/>
             </w:pPr>
             <w:r>
@@ -1512,7 +1779,7 @@
                 <w:sz w:val="21"/>
                 <w:szCs w:val="21"/>
               </w:rPr>
-              <w:t xml:space="preserve">Claude mit Ihren eigenen Dateien arbeiten soll. Cowork braucht ein bezahltes Abo.</w:t>
+              <w:t xml:space="preserve">Claude mit Ihren Dateien arbeiten soll (bezahltes Abo).</w:t>
             </w:r>
           </w:p>
         </w:tc>
@@ -1592,7 +1859,7 @@
                 <w:sz w:val="21"/>
                 <w:szCs w:val="21"/>
               </w:rPr>
-              <w:t xml:space="preserve">Sie Claude eine Woche benutzt haben und wissen wollen, was es wirklich ist.</w:t>
+              <w:t xml:space="preserve">Sie Claude eine Woche benutzt haben.</w:t>
             </w:r>
           </w:p>
         </w:tc>
@@ -1672,7 +1939,7 @@
                 <w:sz w:val="21"/>
                 <w:szCs w:val="21"/>
               </w:rPr>
-              <w:t xml:space="preserve">Ihnen die Grundlagen leicht fallen und Sie echte Dinge bauen wollen.</w:t>
+              <w:t xml:space="preserve">Ihnen die Grundlagen leicht fallen.</w:t>
             </w:r>
           </w:p>
         </w:tc>
@@ -1752,7 +2019,7 @@
                 <w:sz w:val="21"/>
                 <w:szCs w:val="21"/>
               </w:rPr>
-              <w:t xml:space="preserve">Jetzt. Drucken Sie sie aus und legen Sie sie neben Ihren Bildschirm.</w:t>
+              <w:t xml:space="preserve">Jetzt. Ausdrucken und neben den Bildschirm legen.</w:t>
             </w:r>
           </w:p>
         </w:tc>

</xml_diff>